<commit_message>
Explain MATLAB practice through signals and systems concepts
</commit_message>
<xml_diff>
--- a/复习资料/01_第一天从零开始.docx
+++ b/复习资料/01_第一天从零开始.docx
@@ -42,6 +42,191 @@
     <w:p>
       <w:r>
         <w:t>今天的目标只有三个：能保存运行脚本，理解“信号就是一串数”，独立修改并画出新信号。预留 60–90 分钟，遇到报错时可延长到 2 小时。</w:t>
+      </w:r>
+    </w:p>
+    <w:p>
+      <w:pPr>
+        <w:pStyle w:val="Heading1"/>
+      </w:pPr>
+      <w:r>
+        <w:t>先把题目里的信号与系统词翻成白话</w:t>
+      </w:r>
+    </w:p>
+    <w:p>
+      <w:r>
+        <w:t xml:space="preserve">题目中的“信号”就是随时间或样点序号变化的数。连续时间通常用 </w:t>
+      </w:r>
+      <w:r>
+        <w:rPr>
+          <w:rFonts w:ascii="Consolas" w:hAnsi="Consolas"/>
+          <w:sz w:val="20"/>
+          <w:rFonts w:ascii="Consolas" w:hAnsi="Consolas" w:eastAsia="Microsoft YaHei"/>
+        </w:rPr>
+        <w:t>t</w:t>
+      </w:r>
+      <w:r>
+        <w:t xml:space="preserve"> 表示，单位是秒；离散时间通常用 </w:t>
+      </w:r>
+      <w:r>
+        <w:rPr>
+          <w:rFonts w:ascii="Consolas" w:hAnsi="Consolas"/>
+          <w:sz w:val="20"/>
+          <w:rFonts w:ascii="Consolas" w:hAnsi="Consolas" w:eastAsia="Microsoft YaHei"/>
+        </w:rPr>
+        <w:t>n</w:t>
+      </w:r>
+      <w:r>
+        <w:t xml:space="preserve"> 表示，代表第几个样点。MATLAB 不能直接保存无限多个时刻，因此即使要画连续信号，也会先选许多很密的时间点，再在这些点上计算信号值并用 </w:t>
+      </w:r>
+      <w:r>
+        <w:rPr>
+          <w:rFonts w:ascii="Consolas" w:hAnsi="Consolas"/>
+          <w:sz w:val="20"/>
+          <w:rFonts w:ascii="Consolas" w:hAnsi="Consolas" w:eastAsia="Microsoft YaHei"/>
+        </w:rPr>
+        <w:t>plot</w:t>
+      </w:r>
+      <w:r>
+        <w:t xml:space="preserve"> 连起来。</w:t>
+      </w:r>
+    </w:p>
+    <w:p>
+      <w:r>
+        <w:rPr>
+          <w:rFonts w:ascii="Consolas" w:hAnsi="Consolas"/>
+          <w:sz w:val="20"/>
+          <w:rFonts w:ascii="Consolas" w:hAnsi="Consolas" w:eastAsia="Microsoft YaHei"/>
+        </w:rPr>
+        <w:t>x(t)</w:t>
+      </w:r>
+      <w:r>
+        <w:t xml:space="preserve"> 或 </w:t>
+      </w:r>
+      <w:r>
+        <w:rPr>
+          <w:rFonts w:ascii="Consolas" w:hAnsi="Consolas"/>
+          <w:sz w:val="20"/>
+          <w:rFonts w:ascii="Consolas" w:hAnsi="Consolas" w:eastAsia="Microsoft YaHei"/>
+        </w:rPr>
+        <w:t>x[n]</w:t>
+      </w:r>
+      <w:r>
+        <w:t xml:space="preserve"> 通常表示输入信号；</w:t>
+      </w:r>
+      <w:r>
+        <w:rPr>
+          <w:rFonts w:ascii="Consolas" w:hAnsi="Consolas"/>
+          <w:sz w:val="20"/>
+          <w:rFonts w:ascii="Consolas" w:hAnsi="Consolas" w:eastAsia="Microsoft YaHei"/>
+        </w:rPr>
+        <w:t>y(t)</w:t>
+      </w:r>
+      <w:r>
+        <w:t xml:space="preserve"> 或 </w:t>
+      </w:r>
+      <w:r>
+        <w:rPr>
+          <w:rFonts w:ascii="Consolas" w:hAnsi="Consolas"/>
+          <w:sz w:val="20"/>
+          <w:rFonts w:ascii="Consolas" w:hAnsi="Consolas" w:eastAsia="Microsoft YaHei"/>
+        </w:rPr>
+        <w:t>y[n]</w:t>
+      </w:r>
+      <w:r>
+        <w:t xml:space="preserve"> 通常表示输出信号。系统可以把它理解为“处理规则”：将输入送入系统后得到输出。今天先只学习生成和画输入信号；后面学习 </w:t>
+      </w:r>
+      <w:r>
+        <w:rPr>
+          <w:rFonts w:ascii="Consolas" w:hAnsi="Consolas"/>
+          <w:sz w:val="20"/>
+          <w:rFonts w:ascii="Consolas" w:hAnsi="Consolas" w:eastAsia="Microsoft YaHei"/>
+        </w:rPr>
+        <w:t>filter</w:t>
+      </w:r>
+      <w:r>
+        <w:t>、</w:t>
+      </w:r>
+      <w:r>
+        <w:rPr>
+          <w:rFonts w:ascii="Consolas" w:hAnsi="Consolas"/>
+          <w:sz w:val="20"/>
+          <w:rFonts w:ascii="Consolas" w:hAnsi="Consolas" w:eastAsia="Microsoft YaHei"/>
+        </w:rPr>
+        <w:t>lsim</w:t>
+      </w:r>
+      <w:r>
+        <w:t xml:space="preserve"> 时，才会让系统把 </w:t>
+      </w:r>
+      <w:r>
+        <w:rPr>
+          <w:rFonts w:ascii="Consolas" w:hAnsi="Consolas"/>
+          <w:sz w:val="20"/>
+          <w:rFonts w:ascii="Consolas" w:hAnsi="Consolas" w:eastAsia="Microsoft YaHei"/>
+        </w:rPr>
+        <w:t>x</w:t>
+      </w:r>
+      <w:r>
+        <w:t xml:space="preserve"> 变成 </w:t>
+      </w:r>
+      <w:r>
+        <w:rPr>
+          <w:rFonts w:ascii="Consolas" w:hAnsi="Consolas"/>
+          <w:sz w:val="20"/>
+          <w:rFonts w:ascii="Consolas" w:hAnsi="Consolas" w:eastAsia="Microsoft YaHei"/>
+        </w:rPr>
+        <w:t>y</w:t>
+      </w:r>
+      <w:r>
+        <w:t>。</w:t>
+      </w:r>
+    </w:p>
+    <w:p>
+      <w:r>
+        <w:t xml:space="preserve">遇到正弦信号 </w:t>
+      </w:r>
+      <w:r>
+        <w:rPr>
+          <w:rFonts w:ascii="Consolas" w:hAnsi="Consolas"/>
+          <w:sz w:val="20"/>
+          <w:rFonts w:ascii="Consolas" w:hAnsi="Consolas" w:eastAsia="Microsoft YaHei"/>
+        </w:rPr>
+        <w:t>sin(2*pi*f*t)</w:t>
+      </w:r>
+      <w:r>
+        <w:t>，先认三个量：</w:t>
+      </w:r>
+      <w:r>
+        <w:rPr>
+          <w:rFonts w:ascii="Consolas" w:hAnsi="Consolas"/>
+          <w:sz w:val="20"/>
+          <w:rFonts w:ascii="Consolas" w:hAnsi="Consolas" w:eastAsia="Microsoft YaHei"/>
+        </w:rPr>
+        <w:t>t</w:t>
+      </w:r>
+      <w:r>
+        <w:t xml:space="preserve"> 是时间，</w:t>
+      </w:r>
+      <w:r>
+        <w:rPr>
+          <w:rFonts w:ascii="Consolas" w:hAnsi="Consolas"/>
+          <w:sz w:val="20"/>
+          <w:rFonts w:ascii="Consolas" w:hAnsi="Consolas" w:eastAsia="Microsoft YaHei"/>
+        </w:rPr>
+        <w:t>f</w:t>
+      </w:r>
+      <w:r>
+        <w:t xml:space="preserve"> 是频率（Hz，表示每秒振荡几次），前面的系数是振幅。频率变大，波会更密；振幅变大，波会更高。</w:t>
+      </w:r>
+      <w:r>
+        <w:rPr>
+          <w:rFonts w:ascii="Consolas" w:hAnsi="Consolas"/>
+          <w:sz w:val="20"/>
+          <w:rFonts w:ascii="Consolas" w:hAnsi="Consolas" w:eastAsia="Microsoft YaHei"/>
+        </w:rPr>
+        <w:t>exp(-t)</w:t>
+      </w:r>
+      <w:r>
+        <w:t xml:space="preserve"> 叫衰减包络，乘上它会让振荡的高度随时间逐渐变小，但不会改变正弦本身的频率。</w:t>
       </w:r>
     </w:p>
     <w:p>
@@ -262,6 +447,42 @@
     <w:p>
       <w:r>
         <w:t>运行后应看到 0 到 1 秒内的 3 个完整正弦周期，幅度约在 -1 到 1 之间。</w:t>
+      </w:r>
+    </w:p>
+    <w:p>
+      <w:r>
+        <w:t>这张图画的是</w:t>
+      </w:r>
+      <w:r>
+        <w:rPr>
+          <w:b/>
+        </w:rPr>
+        <w:t>输入信号本身</w:t>
+      </w:r>
+      <w:r>
+        <w:t xml:space="preserve">，还没有系统参与。若日后题目问“把这个信号输入某系统后的输出”，就不能只画 </w:t>
+      </w:r>
+      <w:r>
+        <w:rPr>
+          <w:rFonts w:ascii="Consolas" w:hAnsi="Consolas"/>
+          <w:sz w:val="20"/>
+          <w:rFonts w:ascii="Consolas" w:hAnsi="Consolas" w:eastAsia="Microsoft YaHei"/>
+        </w:rPr>
+        <w:t>x</w:t>
+      </w:r>
+      <w:r>
+        <w:t xml:space="preserve">，还要按系统规则算出 </w:t>
+      </w:r>
+      <w:r>
+        <w:rPr>
+          <w:rFonts w:ascii="Consolas" w:hAnsi="Consolas"/>
+          <w:sz w:val="20"/>
+          <w:rFonts w:ascii="Consolas" w:hAnsi="Consolas" w:eastAsia="Microsoft YaHei"/>
+        </w:rPr>
+        <w:t>y</w:t>
+      </w:r>
+      <w:r>
+        <w:t>。</w:t>
       </w:r>
     </w:p>
     <w:p>
@@ -1000,6 +1221,44 @@
       </w:r>
       <w:r>
         <w:t xml:space="preserve"> 会报错。</w:t>
+      </w:r>
+    </w:p>
+    <w:p>
+      <w:r>
+        <w:t>这是信号题很常见的易错点：</w:t>
+      </w:r>
+      <w:r>
+        <w:rPr>
+          <w:rFonts w:ascii="Consolas" w:hAnsi="Consolas"/>
+          <w:sz w:val="20"/>
+          <w:rFonts w:ascii="Consolas" w:hAnsi="Consolas" w:eastAsia="Microsoft YaHei"/>
+        </w:rPr>
+        <w:t>n=0</w:t>
+      </w:r>
+      <w:r>
+        <w:t xml:space="preserve"> 是数学中的“第 0 个样点时刻”，而 MATLAB 中保存它的第一个元素仍是 </w:t>
+      </w:r>
+      <w:r>
+        <w:rPr>
+          <w:rFonts w:ascii="Consolas" w:hAnsi="Consolas"/>
+          <w:sz w:val="20"/>
+          <w:rFonts w:ascii="Consolas" w:hAnsi="Consolas" w:eastAsia="Microsoft YaHei"/>
+        </w:rPr>
+        <w:t>x(1)</w:t>
+      </w:r>
+      <w:r>
+        <w:t xml:space="preserve">。题目若写“n=0 处的值”，要看对应的第一个数组元素，而不是写 </w:t>
+      </w:r>
+      <w:r>
+        <w:rPr>
+          <w:rFonts w:ascii="Consolas" w:hAnsi="Consolas"/>
+          <w:sz w:val="20"/>
+          <w:rFonts w:ascii="Consolas" w:hAnsi="Consolas" w:eastAsia="Microsoft YaHei"/>
+        </w:rPr>
+        <w:t>x(0)</w:t>
+      </w:r>
+      <w:r>
+        <w:t>。</w:t>
       </w:r>
     </w:p>
     <w:p>
@@ -2728,7 +2987,7 @@
     <w:rsid w:val="00FC693F"/>
     <w:pPr>
       <w:widowControl/>
-      <w:spacing w:after="120" w:line="283" w:lineRule="auto"/>
+      <w:spacing w:after="80" w:line="269" w:lineRule="auto"/>
     </w:pPr>
     <w:rPr>
       <w:rFonts w:ascii="Calibri" w:hAnsi="Calibri" w:eastAsia="Microsoft YaHei" w:cs="Calibri"/>

</xml_diff>